<commit_message>
feat: add investment templates and documentation for MobiRides pre-seed round
</commit_message>
<xml_diff>
--- a/docs/data_room/02_investment/Boikhutso Malela Tier 1 Offer - April 2026.docx
+++ b/docs/data_room/02_investment/Boikhutso Malela Tier 1 Offer - April 2026.docx
@@ -214,7 +214,25 @@
           <w:sz w:val="24"/>
           <w:lang w:val="en-US"/>
         </w:rPr>
-        <w:t xml:space="preserve"> April 24, 2026</w:t>
+        <w:t xml:space="preserve"> </w:t>
+      </w:r>
+      <w:r>
+        <w:rPr>
+          <w:rFonts w:ascii="Arial" w:eastAsia="Times New Roman" w:hAnsi="Arial" w:cs="Arial"/>
+          <w:color w:val="000000"/>
+          <w:sz w:val="24"/>
+          <w:lang w:val="en-US"/>
+        </w:rPr>
+        <w:t>May 5th</w:t>
+      </w:r>
+      <w:r>
+        <w:rPr>
+          <w:rFonts w:ascii="Arial" w:eastAsia="Times New Roman" w:hAnsi="Arial" w:cs="Arial"/>
+          <w:color w:val="000000"/>
+          <w:sz w:val="24"/>
+          <w:lang w:val="en-US"/>
+        </w:rPr>
+        <w:t>, 2026</w:t>
       </w:r>
     </w:p>
     <w:p>
@@ -514,7 +532,25 @@
           <w:sz w:val="24"/>
           <w:lang w:val="en-US"/>
         </w:rPr>
-        <w:t xml:space="preserve"> Your funds will support Platform development, Play Store launch, building vehicle inventory (Host onboarding), Rent2Buy pilot, &amp; scoping Uganda/Zambia markets</w:t>
+        <w:t xml:space="preserve"> Your funds will support Platform development, Play Store launch, building vehicle inventory (Host onboarding), </w:t>
+      </w:r>
+      <w:r>
+        <w:rPr>
+          <w:rFonts w:ascii="Arial" w:eastAsia="Times New Roman" w:hAnsi="Arial" w:cs="Arial"/>
+          <w:color w:val="000000"/>
+          <w:sz w:val="24"/>
+          <w:lang w:val="en-US"/>
+        </w:rPr>
+        <w:t xml:space="preserve">&amp; our </w:t>
+      </w:r>
+      <w:r>
+        <w:rPr>
+          <w:rFonts w:ascii="Arial" w:eastAsia="Times New Roman" w:hAnsi="Arial" w:cs="Arial"/>
+          <w:color w:val="000000"/>
+          <w:sz w:val="24"/>
+          <w:lang w:val="en-US"/>
+        </w:rPr>
+        <w:t>Rent2Buy pilot</w:t>
       </w:r>
     </w:p>
     <w:p>
@@ -846,7 +882,25 @@
           <w:sz w:val="24"/>
           <w:lang w:val="en-US"/>
         </w:rPr>
-        <w:t xml:space="preserve">. While this provides you with a 7.5% stake today, it is critical to view this against our benchmarked </w:t>
+        <w:t>. While this provides you with a 7</w:t>
+      </w:r>
+      <w:r>
+        <w:rPr>
+          <w:rFonts w:ascii="Arial" w:eastAsia="Times New Roman" w:hAnsi="Arial" w:cs="Arial"/>
+          <w:color w:val="000000"/>
+          <w:sz w:val="24"/>
+          <w:lang w:val="en-US"/>
+        </w:rPr>
+        <w:t>.5</w:t>
+      </w:r>
+      <w:r>
+        <w:rPr>
+          <w:rFonts w:ascii="Arial" w:eastAsia="Times New Roman" w:hAnsi="Arial" w:cs="Arial"/>
+          <w:color w:val="000000"/>
+          <w:sz w:val="24"/>
+          <w:lang w:val="en-US"/>
+        </w:rPr>
+        <w:t xml:space="preserve">% stake today, it is critical to view this against our benchmarked </w:t>
       </w:r>
       <w:r>
         <w:rPr>
@@ -1070,7 +1124,25 @@
           <w:sz w:val="24"/>
           <w:lang w:val="en-US"/>
         </w:rPr>
-        <w:t xml:space="preserve"> Our SAFE includes an MFN clause. If we issue any future securities to subsequent investors on better terms (e.g., a lower valuation cap), your SAFE will automatically adjust to those better terms. You are protected against any "downside" pricing in the remainder of this round.</w:t>
+        <w:t xml:space="preserve"> Our SAFE includes an MFN clause. If we issue any future securities to subsequent investors on better terms (e.g., a lower valuation), your SAFE will automatically adjust to those better terms</w:t>
+      </w:r>
+      <w:r>
+        <w:rPr>
+          <w:rFonts w:ascii="Arial" w:eastAsia="Times New Roman" w:hAnsi="Arial" w:cs="Arial"/>
+          <w:color w:val="000000"/>
+          <w:sz w:val="24"/>
+          <w:lang w:val="en-US"/>
+        </w:rPr>
+        <w:t xml:space="preserve"> for additional shareholding</w:t>
+      </w:r>
+      <w:r>
+        <w:rPr>
+          <w:rFonts w:ascii="Arial" w:eastAsia="Times New Roman" w:hAnsi="Arial" w:cs="Arial"/>
+          <w:color w:val="000000"/>
+          <w:sz w:val="24"/>
+          <w:lang w:val="en-US"/>
+        </w:rPr>
+        <w:t>. You are protected against any "downside" pricing in the remainder of this round.</w:t>
       </w:r>
     </w:p>
     <w:p>
@@ -1149,7 +1221,29 @@
           <w:sz w:val="24"/>
           <w:lang w:val="en-US"/>
         </w:rPr>
-        <w:t>at least 7.5%</w:t>
+        <w:t>at least 7</w:t>
+      </w:r>
+      <w:r>
+        <w:rPr>
+          <w:rFonts w:ascii="Arial" w:eastAsia="Times New Roman" w:hAnsi="Arial" w:cs="Arial"/>
+          <w:b/>
+          <w:bCs/>
+          <w:color w:val="000000"/>
+          <w:sz w:val="24"/>
+          <w:lang w:val="en-US"/>
+        </w:rPr>
+        <w:t>.5</w:t>
+      </w:r>
+      <w:r>
+        <w:rPr>
+          <w:rFonts w:ascii="Arial" w:eastAsia="Times New Roman" w:hAnsi="Arial" w:cs="Arial"/>
+          <w:b/>
+          <w:bCs/>
+          <w:color w:val="000000"/>
+          <w:sz w:val="24"/>
+          <w:lang w:val="en-US"/>
+        </w:rPr>
+        <w:t>%</w:t>
       </w:r>
       <w:r>
         <w:rPr>
@@ -1223,7 +1317,7 @@
       </w:tblPr>
       <w:tblGrid>
         <w:gridCol w:w="2598"/>
-        <w:gridCol w:w="5449"/>
+        <w:gridCol w:w="4850"/>
       </w:tblGrid>
       <w:tr>
         <w:trPr>
@@ -1641,7 +1735,25 @@
                 <w:sz w:val="24"/>
                 <w:lang w:val="en-US"/>
               </w:rPr>
-              <w:t>7.5% (approx. based on P4M cap)</w:t>
+              <w:t>7</w:t>
+            </w:r>
+            <w:r>
+              <w:rPr>
+                <w:rFonts w:ascii="Arial" w:eastAsia="Times New Roman" w:hAnsi="Arial" w:cs="Arial"/>
+                <w:color w:val="000000"/>
+                <w:sz w:val="24"/>
+                <w:lang w:val="en-US"/>
+              </w:rPr>
+              <w:t>.5</w:t>
+            </w:r>
+            <w:r>
+              <w:rPr>
+                <w:rFonts w:ascii="Arial" w:eastAsia="Times New Roman" w:hAnsi="Arial" w:cs="Arial"/>
+                <w:color w:val="000000"/>
+                <w:sz w:val="24"/>
+                <w:lang w:val="en-US"/>
+              </w:rPr>
+              <w:t>% (approx. based on P4M cap)</w:t>
             </w:r>
           </w:p>
         </w:tc>
@@ -1805,7 +1917,7 @@
                 <w:sz w:val="24"/>
                 <w:lang w:val="en-US"/>
               </w:rPr>
-              <w:t>1 Observer Board Seat &amp; Full Information Rights</w:t>
+              <w:t>Full Information Rights</w:t>
             </w:r>
           </w:p>
         </w:tc>
@@ -1894,7 +2006,6 @@
           <w:szCs w:val="36"/>
           <w:lang w:val="en-US"/>
         </w:rPr>
-        <w:lastRenderedPageBreak/>
         <w:t>IV.</w:t>
       </w:r>
       <w:r>
@@ -1984,7 +2095,25 @@
           <w:sz w:val="24"/>
           <w:lang w:val="en-US"/>
         </w:rPr>
-        <w:t xml:space="preserve">Upon a Conversion Event (Series A or Major Liquidity Event), this SAFE shall convert into Preferred Shares at a price per share equal to the lesser of: (a) the price per share paid by investors in the financing, or (b) the price per share derived from the </w:t>
+        <w:t xml:space="preserve">Upon a Conversion Event (Series A or Major Liquidity Event), this SAFE shall convert into </w:t>
+      </w:r>
+      <w:r>
+        <w:rPr>
+          <w:rFonts w:ascii="Arial" w:eastAsia="Times New Roman" w:hAnsi="Arial" w:cs="Arial"/>
+          <w:color w:val="000000"/>
+          <w:sz w:val="24"/>
+          <w:lang w:val="en-US"/>
+        </w:rPr>
+        <w:t>Ordinary</w:t>
+      </w:r>
+      <w:r>
+        <w:rPr>
+          <w:rFonts w:ascii="Arial" w:eastAsia="Times New Roman" w:hAnsi="Arial" w:cs="Arial"/>
+          <w:color w:val="000000"/>
+          <w:sz w:val="24"/>
+          <w:lang w:val="en-US"/>
+        </w:rPr>
+        <w:t xml:space="preserve"> Shares at a price per share equal to the lesser of: (a) the price per share paid by investors in the financing, or (b) the price per share derived from the </w:t>
       </w:r>
       <w:r>
         <w:rPr>
@@ -2098,7 +2227,25 @@
           <w:sz w:val="24"/>
           <w:lang w:val="en-US"/>
         </w:rPr>
-        <w:t>Issue new equity that results in more than 10% dilution outside of the approved Option Pool.</w:t>
+        <w:t xml:space="preserve">Issue new equity that results in more than </w:t>
+      </w:r>
+      <w:r>
+        <w:rPr>
+          <w:rFonts w:ascii="Arial" w:eastAsia="Times New Roman" w:hAnsi="Arial" w:cs="Arial"/>
+          <w:color w:val="000000"/>
+          <w:sz w:val="24"/>
+          <w:lang w:val="en-US"/>
+        </w:rPr>
+        <w:t>5</w:t>
+      </w:r>
+      <w:r>
+        <w:rPr>
+          <w:rFonts w:ascii="Arial" w:eastAsia="Times New Roman" w:hAnsi="Arial" w:cs="Arial"/>
+          <w:color w:val="000000"/>
+          <w:sz w:val="24"/>
+          <w:lang w:val="en-US"/>
+        </w:rPr>
+        <w:t>0% dilution outside of the approved Option Pool.</w:t>
       </w:r>
     </w:p>
     <w:p>
@@ -2125,7 +2272,25 @@
           <w:sz w:val="24"/>
           <w:lang w:val="en-US"/>
         </w:rPr>
-        <w:t>Incur new corporate debt in excess of P500,000.</w:t>
+        <w:t>Incur new corporate debt in excess of P</w:t>
+      </w:r>
+      <w:r>
+        <w:rPr>
+          <w:rFonts w:ascii="Arial" w:eastAsia="Times New Roman" w:hAnsi="Arial" w:cs="Arial"/>
+          <w:color w:val="000000"/>
+          <w:sz w:val="24"/>
+          <w:lang w:val="en-US"/>
+        </w:rPr>
+        <w:t>1,</w:t>
+      </w:r>
+      <w:r>
+        <w:rPr>
+          <w:rFonts w:ascii="Arial" w:eastAsia="Times New Roman" w:hAnsi="Arial" w:cs="Arial"/>
+          <w:color w:val="000000"/>
+          <w:sz w:val="24"/>
+          <w:lang w:val="en-US"/>
+        </w:rPr>
+        <w:t>500,000.</w:t>
       </w:r>
     </w:p>
     <w:p>
@@ -2194,9 +2359,9 @@
         <w:tblLook w:val="04A0" w:firstRow="1" w:lastRow="0" w:firstColumn="1" w:lastColumn="0" w:noHBand="0" w:noVBand="1"/>
       </w:tblPr>
       <w:tblGrid>
-        <w:gridCol w:w="1800"/>
+        <w:gridCol w:w="1668"/>
         <w:gridCol w:w="1281"/>
-        <w:gridCol w:w="6509"/>
+        <w:gridCol w:w="6641"/>
       </w:tblGrid>
       <w:tr>
         <w:trPr>
@@ -2449,7 +2614,16 @@
                 <w:sz w:val="24"/>
                 <w:lang w:val="en-US"/>
               </w:rPr>
-              <w:t>Pay-U Integration, Google Store Launch &amp; Uganda/Zambia scoping</w:t>
+              <w:t xml:space="preserve">Pay-U Integration, Google Store Launch &amp; Uganda/Zambia </w:t>
+            </w:r>
+            <w:r>
+              <w:rPr>
+                <w:rFonts w:ascii="Arial" w:eastAsia="Times New Roman" w:hAnsi="Arial" w:cs="Arial"/>
+                <w:color w:val="000000"/>
+                <w:sz w:val="24"/>
+                <w:lang w:val="en-US"/>
+              </w:rPr>
+              <w:t>testing</w:t>
             </w:r>
           </w:p>
         </w:tc>
@@ -2568,7 +2742,43 @@
                 <w:sz w:val="24"/>
                 <w:lang w:val="en-US"/>
               </w:rPr>
-              <w:t>Onboarding 122 P2P Host Backlog &amp; 230 Renter signups (Targeting 45% Margin)</w:t>
+              <w:t>Onboarding 122 P2P Host Backlog</w:t>
+            </w:r>
+            <w:r>
+              <w:rPr>
+                <w:rFonts w:ascii="Arial" w:eastAsia="Times New Roman" w:hAnsi="Arial" w:cs="Arial"/>
+                <w:color w:val="000000"/>
+                <w:sz w:val="24"/>
+                <w:lang w:val="en-US"/>
+              </w:rPr>
+              <w:t xml:space="preserve">, </w:t>
+            </w:r>
+            <w:r>
+              <w:rPr>
+                <w:rFonts w:ascii="Arial" w:eastAsia="Times New Roman" w:hAnsi="Arial" w:cs="Arial"/>
+                <w:color w:val="000000"/>
+                <w:sz w:val="24"/>
+                <w:lang w:val="en-US"/>
+              </w:rPr>
+              <w:t>230 Renter signups</w:t>
+            </w:r>
+            <w:r>
+              <w:rPr>
+                <w:rFonts w:ascii="Arial" w:eastAsia="Times New Roman" w:hAnsi="Arial" w:cs="Arial"/>
+                <w:color w:val="000000"/>
+                <w:sz w:val="24"/>
+                <w:lang w:val="en-US"/>
+              </w:rPr>
+              <w:t>, Repair to Pay later launch</w:t>
+            </w:r>
+            <w:r>
+              <w:rPr>
+                <w:rFonts w:ascii="Arial" w:eastAsia="Times New Roman" w:hAnsi="Arial" w:cs="Arial"/>
+                <w:color w:val="000000"/>
+                <w:sz w:val="24"/>
+                <w:lang w:val="en-US"/>
+              </w:rPr>
+              <w:t xml:space="preserve"> (Targeting 45% Margin)</w:t>
             </w:r>
           </w:p>
         </w:tc>
@@ -2687,7 +2897,16 @@
                 <w:sz w:val="24"/>
                 <w:lang w:val="en-US"/>
               </w:rPr>
-              <w:t>15-Month Runway Extension for Core Team, plus Rent2Buy </w:t>
+              <w:t>15-Month Runway Extension for Core Team, plus Rent2Buy</w:t>
+            </w:r>
+            <w:r>
+              <w:rPr>
+                <w:rFonts w:ascii="Arial" w:eastAsia="Times New Roman" w:hAnsi="Arial" w:cs="Arial"/>
+                <w:color w:val="000000"/>
+                <w:sz w:val="24"/>
+                <w:lang w:val="en-US"/>
+              </w:rPr>
+              <w:t xml:space="preserve"> staffing </w:t>
             </w:r>
           </w:p>
         </w:tc>
@@ -2855,22 +3074,6 @@
         <w:spacing w:after="300"/>
         <w:outlineLvl w:val="1"/>
         <w:rPr>
-          <w:rFonts w:ascii="Arial" w:eastAsia="Times New Roman" w:hAnsi="Arial" w:cs="Arial"/>
-          <w:b/>
-          <w:bCs/>
-          <w:color w:val="660000"/>
-          <w:sz w:val="36"/>
-          <w:szCs w:val="36"/>
-          <w:lang w:val="en-US"/>
-        </w:rPr>
-      </w:pPr>
-    </w:p>
-    <w:p>
-      <w:pPr>
-        <w:widowControl/>
-        <w:spacing w:after="300"/>
-        <w:outlineLvl w:val="1"/>
-        <w:rPr>
           <w:rFonts w:ascii="Times New Roman" w:eastAsia="Times New Roman" w:hAnsi="Times New Roman" w:cs="Times New Roman"/>
           <w:b/>
           <w:bCs/>
@@ -3613,8 +3816,6 @@
           <w:lang w:val="en-US"/>
         </w:rPr>
       </w:pPr>
-      <w:bookmarkStart w:id="0" w:name="_GoBack"/>
-      <w:bookmarkEnd w:id="0"/>
     </w:p>
     <w:p>
       <w:pPr>
@@ -3680,7 +3881,27 @@
           <w:sz w:val="24"/>
           <w:lang w:val="en-US"/>
         </w:rPr>
-        <w:t>This offer expires on 5th of May 2026 if not accepted.</w:t>
+        <w:t xml:space="preserve">This offer expires on </w:t>
+      </w:r>
+      <w:r>
+        <w:rPr>
+          <w:rFonts w:ascii="Arial" w:eastAsia="Times New Roman" w:hAnsi="Arial" w:cs="Arial"/>
+          <w:color w:val="000000"/>
+          <w:sz w:val="24"/>
+          <w:lang w:val="en-US"/>
+        </w:rPr>
+        <w:t>10</w:t>
+      </w:r>
+      <w:bookmarkStart w:id="0" w:name="_GoBack"/>
+      <w:bookmarkEnd w:id="0"/>
+      <w:r>
+        <w:rPr>
+          <w:rFonts w:ascii="Arial" w:eastAsia="Times New Roman" w:hAnsi="Arial" w:cs="Arial"/>
+          <w:color w:val="000000"/>
+          <w:sz w:val="24"/>
+          <w:lang w:val="en-US"/>
+        </w:rPr>
+        <w:t>th of May 2026 if not accepted.</w:t>
       </w:r>
     </w:p>
     <w:p>
@@ -4174,6 +4395,9 @@
     </w:tbl>
     <w:p>
       <w:r>
+        <w:rPr>
+          <w:noProof/>
+        </w:rPr>
         <mc:AlternateContent>
           <mc:Choice Requires="wpg">
             <w:drawing>
@@ -4340,6 +4564,9 @@
         </mc:AlternateContent>
       </w:r>
       <w:r>
+        <w:rPr>
+          <w:noProof/>
+        </w:rPr>
         <mc:AlternateContent>
           <mc:Choice Requires="wpg">
             <w:drawing>
@@ -5592,7 +5819,7 @@
             </wp:anchor>
           </w:drawing>
         </mc:Choice>
-        <mc:Fallback xmlns:cr="http://schemas.microsoft.com/office/comments/2020/reactions" xmlns="http://schemas.microsoft.com/office/tasks/2019/documenttasks" xmlns:w16cex="http://schemas.microsoft.com/office/word/2018/wordml/cex" xmlns:w16="http://schemas.microsoft.com/office/word/2018/wordml" xmlns:dgm="http://schemas.openxmlformats.org/drawingml/2006/diagram" xmlns:lc="http://schemas.openxmlformats.org/drawingml/2006/lockedCanvas" xmlns:c="http://schemas.openxmlformats.org/drawingml/2006/chart" xmlns:pic="http://schemas.openxmlformats.org/drawingml/2006/picture" xmlns:a="http://schemas.openxmlformats.org/drawingml/2006/main" xmlns:sl="http://schemas.openxmlformats.org/schemaLibrary/2006/main">
+        <mc:Fallback xmlns:sl="http://schemas.openxmlformats.org/schemaLibrary/2006/main" xmlns:a="http://schemas.openxmlformats.org/drawingml/2006/main" xmlns:pic="http://schemas.openxmlformats.org/drawingml/2006/picture" xmlns:c="http://schemas.openxmlformats.org/drawingml/2006/chart" xmlns:lc="http://schemas.openxmlformats.org/drawingml/2006/lockedCanvas" xmlns:dgm="http://schemas.openxmlformats.org/drawingml/2006/diagram" xmlns:w16="http://schemas.microsoft.com/office/word/2018/wordml" xmlns:w16cex="http://schemas.microsoft.com/office/word/2018/wordml/cex" xmlns="http://schemas.microsoft.com/office/tasks/2019/documenttasks" xmlns:cr="http://schemas.microsoft.com/office/comments/2020/reactions">
           <w:drawing>
             <wp:anchor allowOverlap="1" behindDoc="1" distB="0" distT="0" distL="0" distR="0" hidden="0" layoutInCell="1" locked="0" relativeHeight="0" simplePos="0">
               <wp:simplePos x="0" y="0"/>

</xml_diff>